<commit_message>
Docs : spécifications fonctionnelles, ajout des objets
Co-Authored-By: Claude Opus 5.5 <noreply@anthropic.com>
</commit_message>
<xml_diff>
--- a/docs/Greed Quest - Spécifications fonctionnelles.docx
+++ b/docs/Greed Quest - Spécifications fonctionnelles.docx
@@ -63,7 +63,7 @@
         <w:rPr>
           <w:color w:val="595959"/>
         </w:rPr>
-        <w:t xml:space="preserve">Version du 9 octobre 2026</w:t>
+        <w:t xml:space="preserve">Version du 10 octobre 2026</w:t>
       </w:r>
     </w:p>
     <w:p>
@@ -1881,7 +1881,7 @@
         <w:spacing w:after="120" w:line="300"/>
       </w:pPr>
       <w:r>
-        <w:t xml:space="preserve">Le Livre, c’est la collection du joueur dans l’application. Il contient une place réservée pour chaque carte du catalogue, plus 15 places libres pour les doublons et les sorts. On le feuillette par pages de 10. Quand les 15 places libres sont prises, le Livre est plein : il faut revendre ou échanger avant de pouvoir scanner à nouveau.</w:t>
+        <w:t xml:space="preserve">Le Livre, c’est la collection du joueur dans l’application. Il contient une place réservée pour chaque carte du catalogue, plus 15 places libres pour les doublons et les sorts, et une petite section à part de 8 places pour les objets. On le feuillette par pages de 10. Quand les 15 places libres sont prises, le Livre est plein : il faut revendre ou échanger avant de pouvoir scanner à nouveau.</w:t>
       </w:r>
     </w:p>
     <w:p>
@@ -1960,6 +1960,24 @@
       </w:r>
       <w:r>
         <w:t xml:space="preserve"> : le plus souvent une carte (8 fois sur 10 environ), parfois un sort, plus rarement des jenny. L’application répond toujours en clair, par exemple « Cette balise dort », « Plus rien ici, cherche ailleurs » ou « Attends encore 12 s ».</w:t>
+      </w:r>
+    </w:p>
+    <w:p>
+      <w:pPr>
+        <w:spacing w:after="120" w:line="300"/>
+      </w:pPr>
+      <w:r>
+        <w:t xml:space="preserve">Quand la carte tirée n’est plus disponible (elle a atteint sa limite d’exemplaires), le joueur reçoit 10 jenny à la place, et une fois sur trois </w:t>
+      </w:r>
+      <w:r>
+        <w:rPr>
+          <w:b/>
+          <w:bCs/>
+        </w:rPr>
+        <w:t xml:space="preserve">un objet en plus</w:t>
+      </w:r>
+      <w:r>
+        <w:t xml:space="preserve">.</w:t>
       </w:r>
     </w:p>
     <w:p>
@@ -2694,7 +2712,7 @@
         <w:t xml:space="preserve">Regard</w:t>
       </w:r>
       <w:r>
-        <w:t xml:space="preserve"> est un sort d’information plus rare que les autres. Il ne marche que sur un joueur déjà croisé : quelqu’un qui a été à moins de 30 mètres au moins une fois, ou avec qui on a échangé un sort. On voit ses cartes telles qu’elles paraissent, fausses cartes comprises. Le joueur regardé est prévenu que quelqu’un a consulté son Livre, sans savoir qui. C’est le meilleur moyen de savoir qui détient la SS.</w:t>
+        <w:t xml:space="preserve"> est un sort d’information plus rare que les autres. Il ne marche que sur un joueur déjà croisé : quelqu’un qui a été à moins de 30 mètres au moins une fois, ou qu’on a visé avec un sort (ou qui nous a visé). On voit ses cartes telles qu’elles paraissent, fausses cartes comprises. Le joueur regardé est prévenu que quelqu’un a consulté son Livre, sans savoir qui. C’est le meilleur moyen de savoir qui détient la SS.</w:t>
       </w:r>
     </w:p>
     <w:p>
@@ -2710,7 +2728,7 @@
         <w:pStyle w:val="Heading1"/>
       </w:pPr>
       <w:r>
-        <w:t xml:space="preserve">8. Les lieux et les arbitres</w:t>
+        <w:t xml:space="preserve">8. Les objets</w:t>
       </w:r>
     </w:p>
     <w:p>
@@ -2718,6 +2736,455 @@
         <w:spacing w:after="120" w:line="300"/>
       </w:pPr>
       <w:r>
+        <w:t xml:space="preserve">Les objets forment une troisième famille de cartes, à côté des cartes de collection et des sorts. Ils ne comptent pas pour le Clear. Ce sont des outils : on les utilise sur soi ou sur le terrain, ou on les revend. Contrairement aux sorts, ils sont discrets et n’apparaissent pas sur l’écran géant.</w:t>
+      </w:r>
+    </w:p>
+    <w:p>
+      <w:pPr>
+        <w:spacing w:after="120" w:line="300"/>
+      </w:pPr>
+      <w:r>
+        <w:t xml:space="preserve">On les obtient surtout quand une balise ou l’arène tombe sur une carte qui n’est plus disponible : en plus des 10 jenny habituels, le joueur reçoit un objet une fois sur trois. Chaque joueur en trouve deux ou trois par partie. Ils se rangent dans une section à part du Livre (8 places), s’échangent comme des cartes, mais ne peuvent pas être volés.</w:t>
+      </w:r>
+    </w:p>
+    <w:tbl>
+      <w:tblPr>
+        <w:tblW w:type="dxa" w:w="9026"/>
+        <w:tblBorders>
+          <w:top w:val="single" w:color="auto" w:sz="4"/>
+          <w:left w:val="single" w:color="auto" w:sz="4"/>
+          <w:bottom w:val="single" w:color="auto" w:sz="4"/>
+          <w:right w:val="single" w:color="auto" w:sz="4"/>
+          <w:insideH w:val="single" w:color="auto" w:sz="4"/>
+          <w:insideV w:val="single" w:color="auto" w:sz="4"/>
+        </w:tblBorders>
+      </w:tblPr>
+      <w:tblGrid>
+        <w:gridCol w:w="2600"/>
+        <w:gridCol w:w="6426"/>
+      </w:tblGrid>
+      <w:tr>
+        <w:trPr>
+          <w:tblHeader/>
+        </w:trPr>
+        <w:tc>
+          <w:tcPr>
+            <w:tcW w:type="dxa" w:w="2600"/>
+            <w:tcBorders>
+              <w:top w:val="single" w:color="BFBFBF" w:sz="4"/>
+              <w:left w:val="single" w:color="BFBFBF" w:sz="4"/>
+              <w:bottom w:val="single" w:color="BFBFBF" w:sz="4"/>
+              <w:right w:val="single" w:color="BFBFBF" w:sz="4"/>
+            </w:tcBorders>
+            <w:shd w:fill="F2E9D8" w:color="auto" w:val="clear"/>
+            <w:tcMar>
+              <w:top w:type="dxa" w:w="80"/>
+              <w:left w:type="dxa" w:w="120"/>
+              <w:bottom w:type="dxa" w:w="80"/>
+              <w:right w:type="dxa" w:w="120"/>
+            </w:tcMar>
+          </w:tcPr>
+          <w:p>
+            <w:pPr>
+              <w:spacing w:after="0" w:line="270"/>
+            </w:pPr>
+            <w:r>
+              <w:rPr>
+                <w:b/>
+                <w:bCs/>
+              </w:rPr>
+              <w:t xml:space="preserve">Objet</w:t>
+            </w:r>
+          </w:p>
+        </w:tc>
+        <w:tc>
+          <w:tcPr>
+            <w:tcW w:type="dxa" w:w="6426"/>
+            <w:tcBorders>
+              <w:top w:val="single" w:color="BFBFBF" w:sz="4"/>
+              <w:left w:val="single" w:color="BFBFBF" w:sz="4"/>
+              <w:bottom w:val="single" w:color="BFBFBF" w:sz="4"/>
+              <w:right w:val="single" w:color="BFBFBF" w:sz="4"/>
+            </w:tcBorders>
+            <w:shd w:fill="F2E9D8" w:color="auto" w:val="clear"/>
+            <w:tcMar>
+              <w:top w:type="dxa" w:w="80"/>
+              <w:left w:type="dxa" w:w="120"/>
+              <w:bottom w:type="dxa" w:w="80"/>
+              <w:right w:type="dxa" w:w="120"/>
+            </w:tcMar>
+          </w:tcPr>
+          <w:p>
+            <w:pPr>
+              <w:spacing w:after="0" w:line="270"/>
+            </w:pPr>
+            <w:r>
+              <w:rPr>
+                <w:b/>
+                <w:bCs/>
+              </w:rPr>
+              <w:t xml:space="preserve">Ce qu’il fait</w:t>
+            </w:r>
+          </w:p>
+        </w:tc>
+      </w:tr>
+      <w:tr>
+        <w:trPr>
+          <w:cantSplit/>
+        </w:trPr>
+        <w:tc>
+          <w:tcPr>
+            <w:tcW w:type="dxa" w:w="2600"/>
+            <w:tcBorders>
+              <w:top w:val="single" w:color="BFBFBF" w:sz="4"/>
+              <w:left w:val="single" w:color="BFBFBF" w:sz="4"/>
+              <w:bottom w:val="single" w:color="BFBFBF" w:sz="4"/>
+              <w:right w:val="single" w:color="BFBFBF" w:sz="4"/>
+            </w:tcBorders>
+            <w:tcMar>
+              <w:top w:type="dxa" w:w="80"/>
+              <w:left w:type="dxa" w:w="120"/>
+              <w:bottom w:type="dxa" w:w="80"/>
+              <w:right w:type="dxa" w:w="120"/>
+            </w:tcMar>
+          </w:tcPr>
+          <w:p>
+            <w:pPr>
+              <w:spacing w:after="0" w:line="270"/>
+            </w:pPr>
+            <w:r>
+              <w:t xml:space="preserve">Pépite d’or</w:t>
+            </w:r>
+          </w:p>
+        </w:tc>
+        <w:tc>
+          <w:tcPr>
+            <w:tcW w:type="dxa" w:w="6426"/>
+            <w:tcBorders>
+              <w:top w:val="single" w:color="BFBFBF" w:sz="4"/>
+              <w:left w:val="single" w:color="BFBFBF" w:sz="4"/>
+              <w:bottom w:val="single" w:color="BFBFBF" w:sz="4"/>
+              <w:right w:val="single" w:color="BFBFBF" w:sz="4"/>
+            </w:tcBorders>
+            <w:tcMar>
+              <w:top w:type="dxa" w:w="80"/>
+              <w:left w:type="dxa" w:w="120"/>
+              <w:bottom w:type="dxa" w:w="80"/>
+              <w:right w:type="dxa" w:w="120"/>
+            </w:tcMar>
+          </w:tcPr>
+          <w:p>
+            <w:pPr>
+              <w:spacing w:after="0" w:line="270"/>
+            </w:pPr>
+            <w:r>
+              <w:t xml:space="preserve">Se revend 30 jenny à Masadora (une réserve d’argent qu’on peut aussi échanger)</w:t>
+            </w:r>
+          </w:p>
+        </w:tc>
+      </w:tr>
+      <w:tr>
+        <w:trPr>
+          <w:cantSplit/>
+        </w:trPr>
+        <w:tc>
+          <w:tcPr>
+            <w:tcW w:type="dxa" w:w="2600"/>
+            <w:tcBorders>
+              <w:top w:val="single" w:color="BFBFBF" w:sz="4"/>
+              <w:left w:val="single" w:color="BFBFBF" w:sz="4"/>
+              <w:bottom w:val="single" w:color="BFBFBF" w:sz="4"/>
+              <w:right w:val="single" w:color="BFBFBF" w:sz="4"/>
+            </w:tcBorders>
+            <w:tcMar>
+              <w:top w:type="dxa" w:w="80"/>
+              <w:left w:type="dxa" w:w="120"/>
+              <w:bottom w:type="dxa" w:w="80"/>
+              <w:right w:type="dxa" w:w="120"/>
+            </w:tcMar>
+          </w:tcPr>
+          <w:p>
+            <w:pPr>
+              <w:spacing w:after="0" w:line="270"/>
+            </w:pPr>
+            <w:r>
+              <w:t xml:space="preserve">Ticket de la Fortune</w:t>
+            </w:r>
+          </w:p>
+        </w:tc>
+        <w:tc>
+          <w:tcPr>
+            <w:tcW w:type="dxa" w:w="6426"/>
+            <w:tcBorders>
+              <w:top w:val="single" w:color="BFBFBF" w:sz="4"/>
+              <w:left w:val="single" w:color="BFBFBF" w:sz="4"/>
+              <w:bottom w:val="single" w:color="BFBFBF" w:sz="4"/>
+              <w:right w:val="single" w:color="BFBFBF" w:sz="4"/>
+            </w:tcBorders>
+            <w:tcMar>
+              <w:top w:type="dxa" w:w="80"/>
+              <w:left w:type="dxa" w:w="120"/>
+              <w:bottom w:type="dxa" w:w="80"/>
+              <w:right w:type="dxa" w:w="120"/>
+            </w:tcMar>
+          </w:tcPr>
+          <w:p>
+            <w:pPr>
+              <w:spacing w:after="0" w:line="270"/>
+            </w:pPr>
+            <w:r>
+              <w:t xml:space="preserve">À gratter dans l’application : 0, 10, 30 ou 100 jenny</w:t>
+            </w:r>
+          </w:p>
+        </w:tc>
+      </w:tr>
+      <w:tr>
+        <w:trPr>
+          <w:cantSplit/>
+        </w:trPr>
+        <w:tc>
+          <w:tcPr>
+            <w:tcW w:type="dxa" w:w="2600"/>
+            <w:tcBorders>
+              <w:top w:val="single" w:color="BFBFBF" w:sz="4"/>
+              <w:left w:val="single" w:color="BFBFBF" w:sz="4"/>
+              <w:bottom w:val="single" w:color="BFBFBF" w:sz="4"/>
+              <w:right w:val="single" w:color="BFBFBF" w:sz="4"/>
+            </w:tcBorders>
+            <w:tcMar>
+              <w:top w:type="dxa" w:w="80"/>
+              <w:left w:type="dxa" w:w="120"/>
+              <w:bottom w:type="dxa" w:w="80"/>
+              <w:right w:type="dxa" w:w="120"/>
+            </w:tcMar>
+          </w:tcPr>
+          <w:p>
+            <w:pPr>
+              <w:spacing w:after="0" w:line="270"/>
+            </w:pPr>
+            <w:r>
+              <w:t xml:space="preserve">Boussole du chercheur</w:t>
+            </w:r>
+          </w:p>
+        </w:tc>
+        <w:tc>
+          <w:tcPr>
+            <w:tcW w:type="dxa" w:w="6426"/>
+            <w:tcBorders>
+              <w:top w:val="single" w:color="BFBFBF" w:sz="4"/>
+              <w:left w:val="single" w:color="BFBFBF" w:sz="4"/>
+              <w:bottom w:val="single" w:color="BFBFBF" w:sz="4"/>
+              <w:right w:val="single" w:color="BFBFBF" w:sz="4"/>
+            </w:tcBorders>
+            <w:tcMar>
+              <w:top w:type="dxa" w:w="80"/>
+              <w:left w:type="dxa" w:w="120"/>
+              <w:bottom w:type="dxa" w:w="80"/>
+              <w:right w:type="dxa" w:w="120"/>
+            </w:tcMar>
+          </w:tcPr>
+          <w:p>
+            <w:pPr>
+              <w:spacing w:after="0" w:line="270"/>
+            </w:pPr>
+            <w:r>
+              <w:t xml:space="preserve">Indique dans quelle direction se trouve la balise active la plus proche qu’on n’a jamais scannée (la direction seulement, pas la distance)</w:t>
+            </w:r>
+          </w:p>
+        </w:tc>
+      </w:tr>
+      <w:tr>
+        <w:trPr>
+          <w:cantSplit/>
+        </w:trPr>
+        <w:tc>
+          <w:tcPr>
+            <w:tcW w:type="dxa" w:w="2600"/>
+            <w:tcBorders>
+              <w:top w:val="single" w:color="BFBFBF" w:sz="4"/>
+              <w:left w:val="single" w:color="BFBFBF" w:sz="4"/>
+              <w:bottom w:val="single" w:color="BFBFBF" w:sz="4"/>
+              <w:right w:val="single" w:color="BFBFBF" w:sz="4"/>
+            </w:tcBorders>
+            <w:tcMar>
+              <w:top w:type="dxa" w:w="80"/>
+              <w:left w:type="dxa" w:w="120"/>
+              <w:bottom w:type="dxa" w:w="80"/>
+              <w:right w:type="dxa" w:w="120"/>
+            </w:tcMar>
+          </w:tcPr>
+          <w:p>
+            <w:pPr>
+              <w:spacing w:after="0" w:line="270"/>
+            </w:pPr>
+            <w:r>
+              <w:t xml:space="preserve">Second souffle</w:t>
+            </w:r>
+          </w:p>
+        </w:tc>
+        <w:tc>
+          <w:tcPr>
+            <w:tcW w:type="dxa" w:w="6426"/>
+            <w:tcBorders>
+              <w:top w:val="single" w:color="BFBFBF" w:sz="4"/>
+              <w:left w:val="single" w:color="BFBFBF" w:sz="4"/>
+              <w:bottom w:val="single" w:color="BFBFBF" w:sz="4"/>
+              <w:right w:val="single" w:color="BFBFBF" w:sz="4"/>
+            </w:tcBorders>
+            <w:tcMar>
+              <w:top w:type="dxa" w:w="80"/>
+              <w:left w:type="dxa" w:w="120"/>
+              <w:bottom w:type="dxa" w:w="80"/>
+              <w:right w:type="dxa" w:w="120"/>
+            </w:tcMar>
+          </w:tcPr>
+          <w:p>
+            <w:pPr>
+              <w:spacing w:after="0" w:line="270"/>
+            </w:pPr>
+            <w:r>
+              <w:t xml:space="preserve">Permet de rescanner une balise sans devoir passer d’abord par 3 autres balises</w:t>
+            </w:r>
+          </w:p>
+        </w:tc>
+      </w:tr>
+      <w:tr>
+        <w:trPr>
+          <w:cantSplit/>
+        </w:trPr>
+        <w:tc>
+          <w:tcPr>
+            <w:tcW w:type="dxa" w:w="2600"/>
+            <w:tcBorders>
+              <w:top w:val="single" w:color="BFBFBF" w:sz="4"/>
+              <w:left w:val="single" w:color="BFBFBF" w:sz="4"/>
+              <w:bottom w:val="single" w:color="BFBFBF" w:sz="4"/>
+              <w:right w:val="single" w:color="BFBFBF" w:sz="4"/>
+            </w:tcBorders>
+            <w:tcMar>
+              <w:top w:type="dxa" w:w="80"/>
+              <w:left w:type="dxa" w:w="120"/>
+              <w:bottom w:type="dxa" w:w="80"/>
+              <w:right w:type="dxa" w:w="120"/>
+            </w:tcMar>
+          </w:tcPr>
+          <w:p>
+            <w:pPr>
+              <w:spacing w:after="0" w:line="270"/>
+            </w:pPr>
+            <w:r>
+              <w:t xml:space="preserve">Voile d’ombre</w:t>
+            </w:r>
+          </w:p>
+        </w:tc>
+        <w:tc>
+          <w:tcPr>
+            <w:tcW w:type="dxa" w:w="6426"/>
+            <w:tcBorders>
+              <w:top w:val="single" w:color="BFBFBF" w:sz="4"/>
+              <w:left w:val="single" w:color="BFBFBF" w:sz="4"/>
+              <w:bottom w:val="single" w:color="BFBFBF" w:sz="4"/>
+              <w:right w:val="single" w:color="BFBFBF" w:sz="4"/>
+            </w:tcBorders>
+            <w:tcMar>
+              <w:top w:type="dxa" w:w="80"/>
+              <w:left w:type="dxa" w:w="120"/>
+              <w:bottom w:type="dxa" w:w="80"/>
+              <w:right w:type="dxa" w:w="120"/>
+            </w:tcMar>
+          </w:tcPr>
+          <w:p>
+            <w:pPr>
+              <w:spacing w:after="0" w:line="270"/>
+            </w:pPr>
+            <w:r>
+              <w:t xml:space="preserve">Agit tout seul : bloque le prochain Radar ou Regard lancé sur soi</w:t>
+            </w:r>
+          </w:p>
+        </w:tc>
+      </w:tr>
+      <w:tr>
+        <w:trPr>
+          <w:cantSplit/>
+        </w:trPr>
+        <w:tc>
+          <w:tcPr>
+            <w:tcW w:type="dxa" w:w="2600"/>
+            <w:tcBorders>
+              <w:top w:val="single" w:color="BFBFBF" w:sz="4"/>
+              <w:left w:val="single" w:color="BFBFBF" w:sz="4"/>
+              <w:bottom w:val="single" w:color="BFBFBF" w:sz="4"/>
+              <w:right w:val="single" w:color="BFBFBF" w:sz="4"/>
+            </w:tcBorders>
+            <w:tcMar>
+              <w:top w:type="dxa" w:w="80"/>
+              <w:left w:type="dxa" w:w="120"/>
+              <w:bottom w:type="dxa" w:w="80"/>
+              <w:right w:type="dxa" w:w="120"/>
+            </w:tcMar>
+          </w:tcPr>
+          <w:p>
+            <w:pPr>
+              <w:spacing w:after="0" w:line="270"/>
+            </w:pPr>
+            <w:r>
+              <w:t xml:space="preserve">Coffre scellé</w:t>
+            </w:r>
+          </w:p>
+        </w:tc>
+        <w:tc>
+          <w:tcPr>
+            <w:tcW w:type="dxa" w:w="6426"/>
+            <w:tcBorders>
+              <w:top w:val="single" w:color="BFBFBF" w:sz="4"/>
+              <w:left w:val="single" w:color="BFBFBF" w:sz="4"/>
+              <w:bottom w:val="single" w:color="BFBFBF" w:sz="4"/>
+              <w:right w:val="single" w:color="BFBFBF" w:sz="4"/>
+            </w:tcBorders>
+            <w:tcMar>
+              <w:top w:type="dxa" w:w="80"/>
+              <w:left w:type="dxa" w:w="120"/>
+              <w:bottom w:type="dxa" w:w="80"/>
+              <w:right w:type="dxa" w:w="120"/>
+            </w:tcMar>
+          </w:tcPr>
+          <w:p>
+            <w:pPr>
+              <w:spacing w:after="0" w:line="270"/>
+            </w:pPr>
+            <w:r>
+              <w:t xml:space="preserve">Met une carte de son choix à l’abri pendant 20 minutes : elle ne peut être ni volée ni prise par échange forcé</w:t>
+            </w:r>
+          </w:p>
+        </w:tc>
+      </w:tr>
+    </w:tbl>
+    <w:p>
+      <w:pPr>
+        <w:spacing w:after="60"/>
+      </w:pPr>
+    </w:p>
+    <w:p>
+      <w:pPr>
+        <w:spacing w:after="120" w:line="300"/>
+      </w:pPr>
+      <w:r>
+        <w:t xml:space="preserve">Les objets ont été testés dans le simulateur : donnés en plus des jenny, ils ne rendent pas le Clear plus difficile et l’aident même un peu dans les grands groupes.</w:t>
+      </w:r>
+    </w:p>
+    <w:p>
+      <w:pPr>
+        <w:pStyle w:val="Heading1"/>
+      </w:pPr>
+      <w:r>
+        <w:t xml:space="preserve">9. Les lieux et les arbitres</w:t>
+      </w:r>
+    </w:p>
+    <w:p>
+      <w:pPr>
+        <w:spacing w:after="120" w:line="300"/>
+      </w:pPr>
+      <w:r>
         <w:t xml:space="preserve">Le terrain compte des zones « sauvages » où se trouvent les balises, et trois lieux spéciaux, chacun tenu par un arbitre et doté d’un QR code affiché sur place. Le scanner prouve que le joueur est bien là.</w:t>
       </w:r>
     </w:p>
@@ -2734,7 +3201,7 @@
         <w:spacing w:after="120" w:line="300"/>
       </w:pPr>
       <w:r>
-        <w:t xml:space="preserve">On y achète des paquets de 3 sorts (50 jenny), avec un nombre de paquets limité toutes les 20 minutes. On peut aussi y revendre ses cartes : 5 jenny pour une D, jusqu’à 80 jenny pour une S. La SS ne se revend pas.</w:t>
+        <w:t xml:space="preserve">On y achète des paquets de 3 sorts (50 jenny), avec un nombre de paquets limité toutes les 20 minutes. On peut aussi y revendre ses cartes : 5 jenny pour une D, jusqu’à 80 jenny pour une S. La SS ne se revend pas. Les objets se revendent aussi : 30 jenny pour une Pépite d’or, 10 jenny pour les autres (le Ticket, lui, se gratte).</w:t>
       </w:r>
     </w:p>
     <w:p>
@@ -2816,7 +3283,7 @@
         <w:pStyle w:val="Heading1"/>
       </w:pPr>
       <w:r>
-        <w:t xml:space="preserve">9. Échanger entre joueurs</w:t>
+        <w:t xml:space="preserve">10. Échanger entre joueurs</w:t>
       </w:r>
     </w:p>
     <w:p>
@@ -2863,7 +3330,7 @@
         <w:spacing w:after="80" w:line="290"/>
       </w:pPr>
       <w:r>
-        <w:t xml:space="preserve">Chacun compose sa part (des cartes et/ou des jenny) et voit en direct ce que l’autre propose.</w:t>
+        <w:t xml:space="preserve">Chacun compose sa part (des cartes, des objets et/ou des jenny) et voit en direct ce que l’autre propose.</w:t>
       </w:r>
     </w:p>
     <w:p>
@@ -2892,7 +3359,7 @@
         <w:pStyle w:val="Heading1"/>
       </w:pPr>
       <w:r>
-        <w:t xml:space="preserve">10. Les fausses cartes et le bluff</w:t>
+        <w:t xml:space="preserve">11. Les fausses cartes et le bluff</w:t>
       </w:r>
     </w:p>
     <w:p>
@@ -2962,7 +3429,7 @@
         <w:pStyle w:val="Heading1"/>
       </w:pPr>
       <w:r>
-        <w:t xml:space="preserve">11. Les évènements</w:t>
+        <w:t xml:space="preserve">12. Les évènements</w:t>
       </w:r>
     </w:p>
     <w:p>
@@ -3651,7 +4118,7 @@
         <w:pStyle w:val="Heading1"/>
       </w:pPr>
       <w:r>
-        <w:t xml:space="preserve">12. Gagner</w:t>
+        <w:t xml:space="preserve">13. Gagner</w:t>
       </w:r>
     </w:p>
     <w:p>
@@ -3759,7 +4226,7 @@
         <w:pStyle w:val="Heading1"/>
       </w:pPr>
       <w:r>
-        <w:t xml:space="preserve">13. Fair-play et triche</w:t>
+        <w:t xml:space="preserve">14. Fair-play et triche</w:t>
       </w:r>
     </w:p>
     <w:p>
@@ -4387,7 +4854,7 @@
         <w:pStyle w:val="Heading1"/>
       </w:pPr>
       <w:r>
-        <w:t xml:space="preserve">14. L’écran géant</w:t>
+        <w:t xml:space="preserve">15. L’écran géant</w:t>
       </w:r>
     </w:p>
     <w:p>
@@ -4489,7 +4956,7 @@
         <w:pStyle w:val="Heading1"/>
       </w:pPr>
       <w:r>
-        <w:t xml:space="preserve">15. Position et vie privée</w:t>
+        <w:t xml:space="preserve">16. Position et vie privée</w:t>
       </w:r>
     </w:p>
     <w:p>
@@ -4513,7 +4980,7 @@
         <w:pStyle w:val="Heading1"/>
       </w:pPr>
       <w:r>
-        <w:t xml:space="preserve">16. Les principaux réglages</w:t>
+        <w:t xml:space="preserve">17. Les principaux réglages</w:t>
       </w:r>
     </w:p>
     <w:p>
@@ -5070,6 +5537,61 @@
               <w:spacing w:after="0" w:line="270"/>
             </w:pPr>
             <w:r>
+              <w:t xml:space="preserve">Objets</w:t>
+            </w:r>
+          </w:p>
+        </w:tc>
+        <w:tc>
+          <w:tcPr>
+            <w:tcW w:type="dxa" w:w="5226"/>
+            <w:tcBorders>
+              <w:top w:val="single" w:color="BFBFBF" w:sz="4"/>
+              <w:left w:val="single" w:color="BFBFBF" w:sz="4"/>
+              <w:bottom w:val="single" w:color="BFBFBF" w:sz="4"/>
+              <w:right w:val="single" w:color="BFBFBF" w:sz="4"/>
+            </w:tcBorders>
+            <w:tcMar>
+              <w:top w:type="dxa" w:w="80"/>
+              <w:left w:type="dxa" w:w="120"/>
+              <w:bottom w:type="dxa" w:w="80"/>
+              <w:right w:type="dxa" w:w="120"/>
+            </w:tcMar>
+          </w:tcPr>
+          <w:p>
+            <w:pPr>
+              <w:spacing w:after="0" w:line="270"/>
+            </w:pPr>
+            <w:r>
+              <w:t xml:space="preserve">Un repli sur trois donne un objet ; Coffre scellé de 20 minutes</w:t>
+            </w:r>
+          </w:p>
+        </w:tc>
+      </w:tr>
+      <w:tr>
+        <w:trPr>
+          <w:cantSplit/>
+        </w:trPr>
+        <w:tc>
+          <w:tcPr>
+            <w:tcW w:type="dxa" w:w="3800"/>
+            <w:tcBorders>
+              <w:top w:val="single" w:color="BFBFBF" w:sz="4"/>
+              <w:left w:val="single" w:color="BFBFBF" w:sz="4"/>
+              <w:bottom w:val="single" w:color="BFBFBF" w:sz="4"/>
+              <w:right w:val="single" w:color="BFBFBF" w:sz="4"/>
+            </w:tcBorders>
+            <w:tcMar>
+              <w:top w:type="dxa" w:w="80"/>
+              <w:left w:type="dxa" w:w="120"/>
+              <w:bottom w:type="dxa" w:w="80"/>
+              <w:right w:type="dxa" w:w="120"/>
+            </w:tcMar>
+          </w:tcPr>
+          <w:p>
+            <w:pPr>
+              <w:spacing w:after="0" w:line="270"/>
+            </w:pPr>
+            <w:r>
               <w:t xml:space="preserve">Exemplaires de chaque carte</w:t>
             </w:r>
           </w:p>
@@ -5119,7 +5641,7 @@
         <w:pStyle w:val="Heading1"/>
       </w:pPr>
       <w:r>
-        <w:t xml:space="preserve">17. Où en est le projet</w:t>
+        <w:t xml:space="preserve">18. Où en est le projet</w:t>
       </w:r>
     </w:p>
     <w:p>
@@ -5135,7 +5657,7 @@
         <w:spacing w:after="120" w:line="300"/>
       </w:pPr>
       <w:r>
-        <w:t xml:space="preserve">Quelques points restent à décider : le nom et l’habillage définitifs, le contenu de l’Examen et du test de Nen, les pouvoirs de la Spécialisation, et la possibilité de garder son compte d’une partie à l’autre.</w:t>
+        <w:t xml:space="preserve">Quelques points restent à décider : le nom et l’habillage définitifs, le contenu de l’Examen et du test de Nen, les pouvoirs de la Spécialisation, la possibilité de garder son compte d’une partie à l’autre, et la recharge des pouvoirs de Nen (pour que les pouvoirs « une fois par partie » servent plusieurs fois, avec un délai).</w:t>
       </w:r>
     </w:p>
     <w:sectPr>

</xml_diff>

<commit_message>
Docs : spécifications fonctionnelles, Nen rechargeable
Co-Authored-By: Claude Opus 5.5 <noreply@anthropic.com>
</commit_message>
<xml_diff>
--- a/docs/Greed Quest - Spécifications fonctionnelles.docx
+++ b/docs/Greed Quest - Spécifications fonctionnelles.docx
@@ -979,7 +979,7 @@
         <w:spacing w:after="120" w:line="300"/>
       </w:pPr>
       <w:r>
-        <w:t xml:space="preserve">Cinq questions de personnalité révèlent le type de Nen du joueur. C’est un petit pouvoir qui l’accompagne toute la partie.</w:t>
+        <w:t xml:space="preserve">Cinq questions de personnalité révèlent le type de Nen du joueur. C’est un petit pouvoir qui l’accompagne toute la partie. Une fois utilisé, il se recharge au bout d’un certain temps, si bien que chaque joueur peut s’en servir plusieurs fois.</w:t>
       </w:r>
     </w:p>
     <w:tbl>
@@ -1113,7 +1113,7 @@
               <w:spacing w:after="0" w:line="270"/>
             </w:pPr>
             <w:r>
-              <w:t xml:space="preserve">Annule le premier sort offensif reçu (une fois par partie)</w:t>
+              <w:t xml:space="preserve">Annule le prochain sort offensif reçu (se recharge en 30 minutes)</w:t>
             </w:r>
           </w:p>
         </w:tc>
@@ -1168,7 +1168,7 @@
               <w:spacing w:after="0" w:line="270"/>
             </w:pPr>
             <w:r>
-              <w:t xml:space="preserve">Peut lancer un sort offensif sur un joueur éloigné (une fois par partie)</w:t>
+              <w:t xml:space="preserve">Peut lancer un sort offensif sur un joueur éloigné (se recharge en 40 minutes)</w:t>
             </w:r>
           </w:p>
         </w:tc>
@@ -1278,7 +1278,7 @@
               <w:spacing w:after="0" w:line="270"/>
             </w:pPr>
             <w:r>
-              <w:t xml:space="preserve">Gagne une carte bonus à chaque défi réussi auprès d’un arbitre</w:t>
+              <w:t xml:space="preserve">Gagne un tirage bonus à chaque défi réussi auprès d’un arbitre, et un autre toutes les 40 minutes</w:t>
             </w:r>
           </w:p>
         </w:tc>
@@ -1333,7 +1333,7 @@
               <w:spacing w:after="0" w:line="270"/>
             </w:pPr>
             <w:r>
-              <w:t xml:space="preserve">Un échange forcé gratuit (une fois par partie)</w:t>
+              <w:t xml:space="preserve">Un échange forcé sans carte de sort (se recharge en 40 minutes)</w:t>
             </w:r>
           </w:p>
         </w:tc>
@@ -5592,6 +5592,61 @@
               <w:spacing w:after="0" w:line="270"/>
             </w:pPr>
             <w:r>
+              <w:t xml:space="preserve">Recharge des pouvoirs de Nen</w:t>
+            </w:r>
+          </w:p>
+        </w:tc>
+        <w:tc>
+          <w:tcPr>
+            <w:tcW w:type="dxa" w:w="5226"/>
+            <w:tcBorders>
+              <w:top w:val="single" w:color="BFBFBF" w:sz="4"/>
+              <w:left w:val="single" w:color="BFBFBF" w:sz="4"/>
+              <w:bottom w:val="single" w:color="BFBFBF" w:sz="4"/>
+              <w:right w:val="single" w:color="BFBFBF" w:sz="4"/>
+            </w:tcBorders>
+            <w:tcMar>
+              <w:top w:type="dxa" w:w="80"/>
+              <w:left w:type="dxa" w:w="120"/>
+              <w:bottom w:type="dxa" w:w="80"/>
+              <w:right w:type="dxa" w:w="120"/>
+            </w:tcMar>
+          </w:tcPr>
+          <w:p>
+            <w:pPr>
+              <w:spacing w:after="0" w:line="270"/>
+            </w:pPr>
+            <w:r>
+              <w:t xml:space="preserve">30 minutes (Renforcement), 40 minutes (Émission, Manipulation, tirage bonus de Matérialisation)</w:t>
+            </w:r>
+          </w:p>
+        </w:tc>
+      </w:tr>
+      <w:tr>
+        <w:trPr>
+          <w:cantSplit/>
+        </w:trPr>
+        <w:tc>
+          <w:tcPr>
+            <w:tcW w:type="dxa" w:w="3800"/>
+            <w:tcBorders>
+              <w:top w:val="single" w:color="BFBFBF" w:sz="4"/>
+              <w:left w:val="single" w:color="BFBFBF" w:sz="4"/>
+              <w:bottom w:val="single" w:color="BFBFBF" w:sz="4"/>
+              <w:right w:val="single" w:color="BFBFBF" w:sz="4"/>
+            </w:tcBorders>
+            <w:tcMar>
+              <w:top w:type="dxa" w:w="80"/>
+              <w:left w:type="dxa" w:w="120"/>
+              <w:bottom w:type="dxa" w:w="80"/>
+              <w:right w:type="dxa" w:w="120"/>
+            </w:tcMar>
+          </w:tcPr>
+          <w:p>
+            <w:pPr>
+              <w:spacing w:after="0" w:line="270"/>
+            </w:pPr>
+            <w:r>
               <w:t xml:space="preserve">Exemplaires de chaque carte</w:t>
             </w:r>
           </w:p>
@@ -5657,7 +5712,7 @@
         <w:spacing w:after="120" w:line="300"/>
       </w:pPr>
       <w:r>
-        <w:t xml:space="preserve">Quelques points restent à décider : le nom et l’habillage définitifs, le contenu de l’Examen et du test de Nen, les pouvoirs de la Spécialisation, la possibilité de garder son compte d’une partie à l’autre, et la recharge des pouvoirs de Nen (pour que les pouvoirs « une fois par partie » servent plusieurs fois, avec un délai).</w:t>
+        <w:t xml:space="preserve">Quelques points restent à décider : le nom et l’habillage définitifs, le contenu de l’Examen et du test de Nen, les pouvoirs de la Spécialisation et la possibilité de garder son compte d’une partie à l’autre.</w:t>
       </w:r>
     </w:p>
     <w:sectPr>

</xml_diff>